<commit_message>
Correções no texto da página principal
</commit_message>
<xml_diff>
--- a/texto-principal.docx
+++ b/texto-principal.docx
@@ -66,11 +66,12 @@
           <w:sz w:val="22"/>
           <w:shd w:fill="auto" w:val="clear"/>
         </w:rPr>
-        <w:t xml:space="preserve">Durante muitos anos a perfumaria evoluiu muito, mas teve seu início de forma bem rudimentar. Nos séculos passados os perfumistas começaram a dominar a arte de combinar os elementos da natureza para criar um olor único. Por um bom período de tempo foram considerados bruxos, pois confundidos com os </w:t>
-      </w:r>
-      <w:r>
-        <w:rPr>
-          <w:rFonts w:ascii="Calibri" w:hAnsi="Calibri" w:cs="Calibri" w:eastAsia="Calibri"/>
+        <w:t xml:space="preserve">Durante muitos anos a perfumaria evoluiu muito, mas teve seu início de forma bem rudimentar. Nos séculos passados os perfumistas começaram a dominar a arte de combinar os elementos da natureza para criar um olor único. Por um bom período de tempo foram considerados bruxos, confundidos com </w:t>
+      </w:r>
+      <w:r>
+        <w:rPr>
+          <w:rFonts w:ascii="Calibri" w:hAnsi="Calibri" w:cs="Calibri" w:eastAsia="Calibri"/>
+          <w:b/>
           <w:i/>
           <w:color w:val="auto"/>
           <w:spacing w:val="0"/>

</xml_diff>